<commit_message>
Sơ lược về hệ thống LibraryManagement
</commit_message>
<xml_diff>
--- a/Backend/Document/Mo_ta_he_thong_LibaryManagement.docx
+++ b/Backend/Document/Mo_ta_he_thong_LibaryManagement.docx
@@ -862,14 +862,19 @@
     </w:p>
     <w:p>
       <w:pPr>
-        <w:numPr>
-          <w:ilvl w:val="0"/>
-          <w:numId w:val="1"/>
-        </w:numPr>
-        <w:rPr>
-          <w:rFonts w:ascii="Times New Roman" w:hAnsi="Times New Roman"/>
-        </w:rPr>
-      </w:pPr>
+        <w:ind w:left="720"/>
+        <w:rPr>
+          <w:rFonts w:ascii="Times New Roman" w:hAnsi="Times New Roman"/>
+        </w:rPr>
+      </w:pPr>
+      <w:r>
+        <w:rPr>
+          <w:rFonts w:ascii="Times New Roman" w:hAnsi="Times New Roman"/>
+          <w:b/>
+          <w:bCs/>
+        </w:rPr>
+        <w:t xml:space="preserve">- </w:t>
+      </w:r>
       <w:proofErr w:type="spellStart"/>
       <w:r>
         <w:rPr>
@@ -1181,14 +1186,19 @@
     </w:p>
     <w:p>
       <w:pPr>
-        <w:numPr>
-          <w:ilvl w:val="0"/>
-          <w:numId w:val="1"/>
-        </w:numPr>
-        <w:rPr>
-          <w:rFonts w:ascii="Times New Roman" w:hAnsi="Times New Roman"/>
-        </w:rPr>
-      </w:pPr>
+        <w:ind w:left="720"/>
+        <w:rPr>
+          <w:rFonts w:ascii="Times New Roman" w:hAnsi="Times New Roman"/>
+        </w:rPr>
+      </w:pPr>
+      <w:r>
+        <w:rPr>
+          <w:rFonts w:ascii="Times New Roman" w:hAnsi="Times New Roman"/>
+          <w:b/>
+          <w:bCs/>
+        </w:rPr>
+        <w:t xml:space="preserve">- </w:t>
+      </w:r>
       <w:proofErr w:type="spellStart"/>
       <w:r>
         <w:rPr>
@@ -1652,14 +1662,17 @@
     </w:p>
     <w:p>
       <w:pPr>
-        <w:numPr>
-          <w:ilvl w:val="0"/>
-          <w:numId w:val="2"/>
-        </w:numPr>
-        <w:rPr>
-          <w:rFonts w:ascii="Times New Roman" w:hAnsi="Times New Roman"/>
-        </w:rPr>
-      </w:pPr>
+        <w:ind w:left="720"/>
+        <w:rPr>
+          <w:rFonts w:ascii="Times New Roman" w:hAnsi="Times New Roman"/>
+        </w:rPr>
+      </w:pPr>
+      <w:r>
+        <w:rPr>
+          <w:rFonts w:ascii="Times New Roman" w:hAnsi="Times New Roman"/>
+        </w:rPr>
+        <w:t xml:space="preserve">-  </w:t>
+      </w:r>
       <w:proofErr w:type="spellStart"/>
       <w:r>
         <w:rPr>
@@ -1929,14 +1942,17 @@
     </w:p>
     <w:p>
       <w:pPr>
-        <w:numPr>
-          <w:ilvl w:val="0"/>
-          <w:numId w:val="2"/>
-        </w:numPr>
-        <w:rPr>
-          <w:rFonts w:ascii="Times New Roman" w:hAnsi="Times New Roman"/>
-        </w:rPr>
-      </w:pPr>
+        <w:ind w:left="720"/>
+        <w:rPr>
+          <w:rFonts w:ascii="Times New Roman" w:hAnsi="Times New Roman"/>
+        </w:rPr>
+      </w:pPr>
+      <w:r>
+        <w:rPr>
+          <w:rFonts w:ascii="Times New Roman" w:hAnsi="Times New Roman"/>
+        </w:rPr>
+        <w:t xml:space="preserve">-  </w:t>
+      </w:r>
       <w:proofErr w:type="spellStart"/>
       <w:r>
         <w:rPr>
@@ -2157,14 +2173,17 @@
     </w:p>
     <w:p>
       <w:pPr>
-        <w:numPr>
-          <w:ilvl w:val="0"/>
-          <w:numId w:val="3"/>
-        </w:numPr>
-        <w:rPr>
-          <w:rFonts w:ascii="Times New Roman" w:hAnsi="Times New Roman"/>
-        </w:rPr>
-      </w:pPr>
+        <w:ind w:left="720"/>
+        <w:rPr>
+          <w:rFonts w:ascii="Times New Roman" w:hAnsi="Times New Roman"/>
+        </w:rPr>
+      </w:pPr>
+      <w:r>
+        <w:rPr>
+          <w:rFonts w:ascii="Times New Roman" w:hAnsi="Times New Roman"/>
+        </w:rPr>
+        <w:t xml:space="preserve">-  </w:t>
+      </w:r>
       <w:proofErr w:type="spellStart"/>
       <w:r>
         <w:rPr>
@@ -2177,21 +2196,7 @@
         <w:rPr>
           <w:rFonts w:ascii="Times New Roman" w:hAnsi="Times New Roman"/>
         </w:rPr>
-        <w:t xml:space="preserve"> </w:t>
-      </w:r>
-      <w:proofErr w:type="spellStart"/>
-      <w:r>
-        <w:rPr>
-          <w:rFonts w:ascii="Times New Roman" w:hAnsi="Times New Roman"/>
-        </w:rPr>
-        <w:t>ký</w:t>
-      </w:r>
-      <w:proofErr w:type="spellEnd"/>
-      <w:r>
-        <w:rPr>
-          <w:rFonts w:ascii="Times New Roman" w:hAnsi="Times New Roman"/>
-        </w:rPr>
-        <w:t xml:space="preserve"> </w:t>
+        <w:t xml:space="preserve"> ký </w:t>
       </w:r>
       <w:proofErr w:type="spellStart"/>
       <w:r>
@@ -2266,14 +2271,17 @@
     </w:p>
     <w:p>
       <w:pPr>
-        <w:numPr>
-          <w:ilvl w:val="0"/>
-          <w:numId w:val="3"/>
-        </w:numPr>
-        <w:rPr>
-          <w:rFonts w:ascii="Times New Roman" w:hAnsi="Times New Roman"/>
-        </w:rPr>
-      </w:pPr>
+        <w:ind w:left="720"/>
+        <w:rPr>
+          <w:rFonts w:ascii="Times New Roman" w:hAnsi="Times New Roman"/>
+        </w:rPr>
+      </w:pPr>
+      <w:r>
+        <w:rPr>
+          <w:rFonts w:ascii="Times New Roman" w:hAnsi="Times New Roman"/>
+        </w:rPr>
+        <w:t xml:space="preserve">- </w:t>
+      </w:r>
       <w:r>
         <w:rPr>
           <w:rFonts w:ascii="Times New Roman" w:hAnsi="Times New Roman"/>
@@ -2494,14 +2502,19 @@
     </w:p>
     <w:p>
       <w:pPr>
-        <w:numPr>
-          <w:ilvl w:val="0"/>
-          <w:numId w:val="4"/>
-        </w:numPr>
-        <w:rPr>
-          <w:rFonts w:ascii="Times New Roman" w:hAnsi="Times New Roman"/>
-        </w:rPr>
-      </w:pPr>
+        <w:ind w:left="720"/>
+        <w:rPr>
+          <w:rFonts w:ascii="Times New Roman" w:hAnsi="Times New Roman"/>
+        </w:rPr>
+      </w:pPr>
+      <w:r>
+        <w:rPr>
+          <w:rFonts w:ascii="Times New Roman" w:hAnsi="Times New Roman"/>
+          <w:b/>
+          <w:bCs/>
+        </w:rPr>
+        <w:t xml:space="preserve">-  </w:t>
+      </w:r>
       <w:proofErr w:type="spellStart"/>
       <w:r>
         <w:rPr>
@@ -2771,14 +2784,19 @@
     </w:p>
     <w:p>
       <w:pPr>
-        <w:numPr>
-          <w:ilvl w:val="0"/>
-          <w:numId w:val="4"/>
-        </w:numPr>
-        <w:rPr>
-          <w:rFonts w:ascii="Times New Roman" w:hAnsi="Times New Roman"/>
-        </w:rPr>
-      </w:pPr>
+        <w:ind w:left="720"/>
+        <w:rPr>
+          <w:rFonts w:ascii="Times New Roman" w:hAnsi="Times New Roman"/>
+        </w:rPr>
+      </w:pPr>
+      <w:r>
+        <w:rPr>
+          <w:rFonts w:ascii="Times New Roman" w:hAnsi="Times New Roman"/>
+          <w:b/>
+          <w:bCs/>
+        </w:rPr>
+        <w:t xml:space="preserve">-  </w:t>
+      </w:r>
       <w:proofErr w:type="spellStart"/>
       <w:r>
         <w:rPr>
@@ -3111,14 +3129,17 @@
     </w:p>
     <w:p>
       <w:pPr>
-        <w:numPr>
-          <w:ilvl w:val="0"/>
-          <w:numId w:val="5"/>
-        </w:numPr>
-        <w:rPr>
-          <w:rFonts w:ascii="Times New Roman" w:hAnsi="Times New Roman"/>
-        </w:rPr>
-      </w:pPr>
+        <w:ind w:left="720"/>
+        <w:rPr>
+          <w:rFonts w:ascii="Times New Roman" w:hAnsi="Times New Roman"/>
+        </w:rPr>
+      </w:pPr>
+      <w:r>
+        <w:rPr>
+          <w:rFonts w:ascii="Times New Roman" w:hAnsi="Times New Roman"/>
+        </w:rPr>
+        <w:t xml:space="preserve">- </w:t>
+      </w:r>
       <w:proofErr w:type="spellStart"/>
       <w:r>
         <w:rPr>
@@ -3248,14 +3269,17 @@
     </w:p>
     <w:p>
       <w:pPr>
-        <w:numPr>
-          <w:ilvl w:val="0"/>
-          <w:numId w:val="5"/>
-        </w:numPr>
-        <w:rPr>
-          <w:rFonts w:ascii="Times New Roman" w:hAnsi="Times New Roman"/>
-        </w:rPr>
-      </w:pPr>
+        <w:ind w:left="720"/>
+        <w:rPr>
+          <w:rFonts w:ascii="Times New Roman" w:hAnsi="Times New Roman"/>
+        </w:rPr>
+      </w:pPr>
+      <w:r>
+        <w:rPr>
+          <w:rFonts w:ascii="Times New Roman" w:hAnsi="Times New Roman"/>
+        </w:rPr>
+        <w:t xml:space="preserve">- </w:t>
+      </w:r>
       <w:proofErr w:type="spellStart"/>
       <w:r>
         <w:rPr>
@@ -3399,14 +3423,17 @@
     </w:p>
     <w:p>
       <w:pPr>
-        <w:numPr>
-          <w:ilvl w:val="0"/>
-          <w:numId w:val="5"/>
-        </w:numPr>
-        <w:rPr>
-          <w:rFonts w:ascii="Times New Roman" w:hAnsi="Times New Roman"/>
-        </w:rPr>
-      </w:pPr>
+        <w:ind w:left="720"/>
+        <w:rPr>
+          <w:rFonts w:ascii="Times New Roman" w:hAnsi="Times New Roman"/>
+        </w:rPr>
+      </w:pPr>
+      <w:r>
+        <w:rPr>
+          <w:rFonts w:ascii="Times New Roman" w:hAnsi="Times New Roman"/>
+        </w:rPr>
+        <w:t xml:space="preserve">- </w:t>
+      </w:r>
       <w:r>
         <w:rPr>
           <w:rFonts w:ascii="Times New Roman" w:hAnsi="Times New Roman"/>
@@ -3901,6 +3928,7 @@
           <w:b/>
           <w:bCs/>
         </w:rPr>
+        <w:lastRenderedPageBreak/>
         <w:t>Database:</w:t>
       </w:r>
       <w:r>
@@ -4036,6 +4064,128 @@
 <file path=word/numbering.xml><?xml version="1.0" encoding="utf-8"?>
 <w:numbering xmlns:wpc="http://schemas.microsoft.com/office/word/2010/wordprocessingCanvas" xmlns:cx="http://schemas.microsoft.com/office/drawing/2014/chartex" xmlns:cx1="http://schemas.microsoft.com/office/drawing/2015/9/8/chartex" xmlns:cx2="http://schemas.microsoft.com/office/drawing/2015/10/21/chartex" xmlns:cx3="http://schemas.microsoft.com/office/drawing/2016/5/9/chartex" xmlns:cx4="http://schemas.microsoft.com/office/drawing/2016/5/10/chartex" xmlns:cx5="http://schemas.microsoft.com/office/drawing/2016/5/11/chartex" xmlns:cx6="http://schemas.microsoft.com/office/drawing/2016/5/12/chartex" xmlns:cx7="http://schemas.microsoft.com/office/drawing/2016/5/13/chartex" xmlns:cx8="http://schemas.microsoft.com/office/drawing/2016/5/14/chartex" xmlns:mc="http://schemas.openxmlformats.org/markup-compatibility/2006" xmlns:aink="http://schemas.microsoft.com/office/drawing/2016/ink" xmlns:am3d="http://schemas.microsoft.com/office/drawing/2017/model3d" xmlns:o="urn:schemas-microsoft-com:office:office" xmlns:oel="http://schemas.microsoft.com/office/2019/extlst" xmlns:r="http://schemas.openxmlformats.org/officeDocument/2006/relationships" xmlns:m="http://schemas.openxmlformats.org/officeDocument/2006/math" xmlns:v="urn:schemas-microsoft-com:vml" xmlns:wp14="http://schemas.microsoft.com/office/word/2010/wordprocessingDrawing" xmlns:wp="http://schemas.openxmlformats.org/drawingml/2006/wordprocessingDrawing" xmlns:w10="urn:schemas-microsoft-com:office:word" xmlns:w="http://schemas.openxmlformats.org/wordprocessingml/2006/main" xmlns:w14="http://schemas.microsoft.com/office/word/2010/wordml" xmlns:w15="http://schemas.microsoft.com/office/word/2012/wordml" xmlns:w16cex="http://schemas.microsoft.com/office/word/2018/wordml/cex" xmlns:w16cid="http://schemas.microsoft.com/office/word/2016/wordml/cid" xmlns:w16="http://schemas.microsoft.com/office/word/2018/wordml" xmlns:w16du="http://schemas.microsoft.com/office/word/2023/wordml/word16du" xmlns:w16sdtdh="http://schemas.microsoft.com/office/word/2020/wordml/sdtdatahash" xmlns:w16se="http://schemas.microsoft.com/office/word/2015/wordml/symex" xmlns:wpg="http://schemas.microsoft.com/office/word/2010/wordprocessingGroup" xmlns:wpi="http://schemas.microsoft.com/office/word/2010/wordprocessingInk" xmlns:wne="http://schemas.microsoft.com/office/word/2006/wordml" xmlns:wps="http://schemas.microsoft.com/office/word/2010/wordprocessingShape" mc:Ignorable="w14 w15 w16se w16cid w16 w16cex w16sdtdh w16du wp14">
   <w:abstractNum w:abstractNumId="0" w15:restartNumberingAfterBreak="0">
+    <w:nsid w:val="0A550592"/>
+    <w:multiLevelType w:val="multilevel"/>
+    <w:tmpl w:val="B7C811C6"/>
+    <w:lvl w:ilvl="0">
+      <w:start w:val="2"/>
+      <w:numFmt w:val="decimal"/>
+      <w:lvlText w:val="%1"/>
+      <w:lvlJc w:val="left"/>
+      <w:pPr>
+        <w:ind w:left="360" w:hanging="360"/>
+      </w:pPr>
+      <w:rPr>
+        <w:rFonts w:hint="default"/>
+        <w:b/>
+      </w:rPr>
+    </w:lvl>
+    <w:lvl w:ilvl="1">
+      <w:start w:val="1"/>
+      <w:numFmt w:val="decimal"/>
+      <w:lvlText w:val="%1.%2"/>
+      <w:lvlJc w:val="left"/>
+      <w:pPr>
+        <w:ind w:left="1080" w:hanging="360"/>
+      </w:pPr>
+      <w:rPr>
+        <w:rFonts w:hint="default"/>
+        <w:b/>
+      </w:rPr>
+    </w:lvl>
+    <w:lvl w:ilvl="2">
+      <w:start w:val="1"/>
+      <w:numFmt w:val="decimal"/>
+      <w:lvlText w:val="%1.%2.%3"/>
+      <w:lvlJc w:val="left"/>
+      <w:pPr>
+        <w:ind w:left="2160" w:hanging="720"/>
+      </w:pPr>
+      <w:rPr>
+        <w:rFonts w:hint="default"/>
+        <w:b/>
+      </w:rPr>
+    </w:lvl>
+    <w:lvl w:ilvl="3">
+      <w:start w:val="1"/>
+      <w:numFmt w:val="decimal"/>
+      <w:lvlText w:val="%1.%2.%3.%4"/>
+      <w:lvlJc w:val="left"/>
+      <w:pPr>
+        <w:ind w:left="2880" w:hanging="720"/>
+      </w:pPr>
+      <w:rPr>
+        <w:rFonts w:hint="default"/>
+        <w:b/>
+      </w:rPr>
+    </w:lvl>
+    <w:lvl w:ilvl="4">
+      <w:start w:val="1"/>
+      <w:numFmt w:val="decimal"/>
+      <w:lvlText w:val="%1.%2.%3.%4.%5"/>
+      <w:lvlJc w:val="left"/>
+      <w:pPr>
+        <w:ind w:left="3960" w:hanging="1080"/>
+      </w:pPr>
+      <w:rPr>
+        <w:rFonts w:hint="default"/>
+        <w:b/>
+      </w:rPr>
+    </w:lvl>
+    <w:lvl w:ilvl="5">
+      <w:start w:val="1"/>
+      <w:numFmt w:val="decimal"/>
+      <w:lvlText w:val="%1.%2.%3.%4.%5.%6"/>
+      <w:lvlJc w:val="left"/>
+      <w:pPr>
+        <w:ind w:left="4680" w:hanging="1080"/>
+      </w:pPr>
+      <w:rPr>
+        <w:rFonts w:hint="default"/>
+        <w:b/>
+      </w:rPr>
+    </w:lvl>
+    <w:lvl w:ilvl="6">
+      <w:start w:val="1"/>
+      <w:numFmt w:val="decimal"/>
+      <w:lvlText w:val="%1.%2.%3.%4.%5.%6.%7"/>
+      <w:lvlJc w:val="left"/>
+      <w:pPr>
+        <w:ind w:left="5760" w:hanging="1440"/>
+      </w:pPr>
+      <w:rPr>
+        <w:rFonts w:hint="default"/>
+        <w:b/>
+      </w:rPr>
+    </w:lvl>
+    <w:lvl w:ilvl="7">
+      <w:start w:val="1"/>
+      <w:numFmt w:val="decimal"/>
+      <w:lvlText w:val="%1.%2.%3.%4.%5.%6.%7.%8"/>
+      <w:lvlJc w:val="left"/>
+      <w:pPr>
+        <w:ind w:left="6480" w:hanging="1440"/>
+      </w:pPr>
+      <w:rPr>
+        <w:rFonts w:hint="default"/>
+        <w:b/>
+      </w:rPr>
+    </w:lvl>
+    <w:lvl w:ilvl="8">
+      <w:start w:val="1"/>
+      <w:numFmt w:val="decimal"/>
+      <w:lvlText w:val="%1.%2.%3.%4.%5.%6.%7.%8.%9"/>
+      <w:lvlJc w:val="left"/>
+      <w:pPr>
+        <w:ind w:left="7560" w:hanging="1800"/>
+      </w:pPr>
+      <w:rPr>
+        <w:rFonts w:hint="default"/>
+        <w:b/>
+      </w:rPr>
+    </w:lvl>
+  </w:abstractNum>
+  <w:abstractNum w:abstractNumId="1" w15:restartNumberingAfterBreak="0">
     <w:nsid w:val="0A9E75BC"/>
     <w:multiLevelType w:val="multilevel"/>
     <w:tmpl w:val="09B24D62"/>
@@ -4184,7 +4334,7 @@
       </w:rPr>
     </w:lvl>
   </w:abstractNum>
-  <w:abstractNum w:abstractNumId="1" w15:restartNumberingAfterBreak="0">
+  <w:abstractNum w:abstractNumId="2" w15:restartNumberingAfterBreak="0">
     <w:nsid w:val="194E78A2"/>
     <w:multiLevelType w:val="multilevel"/>
     <w:tmpl w:val="56D8EFDE"/>
@@ -4333,7 +4483,7 @@
       </w:rPr>
     </w:lvl>
   </w:abstractNum>
-  <w:abstractNum w:abstractNumId="2" w15:restartNumberingAfterBreak="0">
+  <w:abstractNum w:abstractNumId="3" w15:restartNumberingAfterBreak="0">
     <w:nsid w:val="1F64644C"/>
     <w:multiLevelType w:val="multilevel"/>
     <w:tmpl w:val="26004A5E"/>
@@ -4482,7 +4632,7 @@
       </w:rPr>
     </w:lvl>
   </w:abstractNum>
-  <w:abstractNum w:abstractNumId="3" w15:restartNumberingAfterBreak="0">
+  <w:abstractNum w:abstractNumId="4" w15:restartNumberingAfterBreak="0">
     <w:nsid w:val="40CF1452"/>
     <w:multiLevelType w:val="multilevel"/>
     <w:tmpl w:val="80EC630A"/>
@@ -4631,7 +4781,7 @@
       </w:rPr>
     </w:lvl>
   </w:abstractNum>
-  <w:abstractNum w:abstractNumId="4" w15:restartNumberingAfterBreak="0">
+  <w:abstractNum w:abstractNumId="5" w15:restartNumberingAfterBreak="0">
     <w:nsid w:val="47276020"/>
     <w:multiLevelType w:val="multilevel"/>
     <w:tmpl w:val="F82EBE74"/>
@@ -4780,7 +4930,7 @@
       </w:rPr>
     </w:lvl>
   </w:abstractNum>
-  <w:abstractNum w:abstractNumId="5" w15:restartNumberingAfterBreak="0">
+  <w:abstractNum w:abstractNumId="6" w15:restartNumberingAfterBreak="0">
     <w:nsid w:val="5DCD4C34"/>
     <w:multiLevelType w:val="multilevel"/>
     <w:tmpl w:val="35C075CA"/>
@@ -4930,22 +5080,25 @@
     </w:lvl>
   </w:abstractNum>
   <w:num w:numId="1" w16cid:durableId="1544243549">
+    <w:abstractNumId w:val="2"/>
+  </w:num>
+  <w:num w:numId="2" w16cid:durableId="2026665712">
+    <w:abstractNumId w:val="5"/>
+  </w:num>
+  <w:num w:numId="3" w16cid:durableId="1217009917">
+    <w:abstractNumId w:val="3"/>
+  </w:num>
+  <w:num w:numId="4" w16cid:durableId="407387967">
+    <w:abstractNumId w:val="6"/>
+  </w:num>
+  <w:num w:numId="5" w16cid:durableId="477958750">
     <w:abstractNumId w:val="1"/>
   </w:num>
-  <w:num w:numId="2" w16cid:durableId="2026665712">
+  <w:num w:numId="6" w16cid:durableId="178280599">
     <w:abstractNumId w:val="4"/>
   </w:num>
-  <w:num w:numId="3" w16cid:durableId="1217009917">
-    <w:abstractNumId w:val="2"/>
-  </w:num>
-  <w:num w:numId="4" w16cid:durableId="407387967">
-    <w:abstractNumId w:val="5"/>
-  </w:num>
-  <w:num w:numId="5" w16cid:durableId="477958750">
+  <w:num w:numId="7" w16cid:durableId="432897080">
     <w:abstractNumId w:val="0"/>
-  </w:num>
-  <w:num w:numId="6" w16cid:durableId="178280599">
-    <w:abstractNumId w:val="3"/>
   </w:num>
 </w:numbering>
 </file>
@@ -5553,6 +5706,7 @@
   <w:style w:type="character" w:default="1" w:styleId="DefaultParagraphFont">
     <w:name w:val="Default Paragraph Font"/>
     <w:uiPriority w:val="1"/>
+    <w:semiHidden/>
     <w:unhideWhenUsed/>
   </w:style>
   <w:style w:type="table" w:default="1" w:styleId="TableNormal">

</xml_diff>